<commit_message>
Agrega la seccion del patron Builder al documento Word
- Seccion 'Aplicacion del Patron de Diseno Builder en la Generacion de Reportes
  Energeticos' con subsecciones (problema, solucion, que gana, justificacion, validacion)
- Figura 12 (codigo de ReporteBuilder/DirectorReportes) y placeholders de Figuras 13-15
- Entradas en Tabla de Contenido y Tabla de Ilustraciones con sus marcadores
- Actualiza Resumen, palabras clave, Conclusion (4 patrones) y Referencias
</commit_message>
<xml_diff>
--- a/Documentacion/plataforma-Comercio-Energia.docx
+++ b/Documentacion/plataforma-Comercio-Energia.docx
@@ -1458,6 +1458,292 @@
           <w:tab w:val="right" w:leader="dot" w:pos="9360"/>
         </w:tabs>
         <w:spacing w:after="80" w:line="360" w:lineRule="auto"/>
+        <w:ind w:left="360"/>
+        <w:rPr>
+          <w:lang w:val="es-CO"/>
+        </w:rPr>
+      </w:pPr>
+      <w:r>
+        <w:rPr>
+          <w:lang w:val="es-CO"/>
+        </w:rPr>
+        <w:t xml:space="preserve">Aplicación del Patrón de Diseño Builder en la Generación de Reportes Energéticos</w:t>
+      </w:r>
+      <w:r>
+        <w:rPr>
+          <w:lang w:val="es-CO"/>
+        </w:rPr>
+        <w:tab/>
+      </w:r>
+      <w:r>
+        <w:fldChar w:fldCharType="begin"/>
+      </w:r>
+      <w:r>
+        <w:rPr>
+          <w:lang w:val="es-CO"/>
+        </w:rPr>
+        <w:instrText>PAGEREF bm_builder \h</w:instrText>
+      </w:r>
+      <w:r>
+        <w:fldChar w:fldCharType="separate"/>
+      </w:r>
+      <w:r>
+        <w:rPr>
+          <w:noProof/>
+          <w:lang w:val="es-CO"/>
+        </w:rPr>
+        <w:t>1</w:t>
+      </w:r>
+      <w:r>
+        <w:fldChar w:fldCharType="end"/>
+      </w:r>
+    </w:p>
+    <w:p>
+      <w:pPr>
+        <w:tabs>
+          <w:tab w:val="right" w:leader="dot" w:pos="9360"/>
+        </w:tabs>
+        <w:spacing w:after="80" w:line="360" w:lineRule="auto"/>
+        <w:ind w:left="720"/>
+        <w:rPr>
+          <w:lang w:val="es-CO"/>
+        </w:rPr>
+      </w:pPr>
+      <w:r>
+        <w:rPr>
+          <w:i/>
+          <w:iCs/>
+          <w:lang w:val="es-CO"/>
+        </w:rPr>
+        <w:t xml:space="preserve">El Problema que Resuelve</w:t>
+      </w:r>
+      <w:r>
+        <w:rPr>
+          <w:lang w:val="es-CO"/>
+        </w:rPr>
+        <w:tab/>
+      </w:r>
+      <w:r>
+        <w:fldChar w:fldCharType="begin"/>
+      </w:r>
+      <w:r>
+        <w:rPr>
+          <w:lang w:val="es-CO"/>
+        </w:rPr>
+        <w:instrText>PAGEREF bm_builder_problema \h</w:instrText>
+      </w:r>
+      <w:r>
+        <w:fldChar w:fldCharType="separate"/>
+      </w:r>
+      <w:r>
+        <w:rPr>
+          <w:noProof/>
+          <w:lang w:val="es-CO"/>
+        </w:rPr>
+        <w:t>1</w:t>
+      </w:r>
+      <w:r>
+        <w:fldChar w:fldCharType="end"/>
+      </w:r>
+    </w:p>
+    <w:p>
+      <w:pPr>
+        <w:tabs>
+          <w:tab w:val="right" w:leader="dot" w:pos="9360"/>
+        </w:tabs>
+        <w:spacing w:after="80" w:line="360" w:lineRule="auto"/>
+        <w:ind w:left="720"/>
+        <w:rPr>
+          <w:lang w:val="es-CO"/>
+        </w:rPr>
+      </w:pPr>
+      <w:r>
+        <w:rPr>
+          <w:i/>
+          <w:iCs/>
+          <w:lang w:val="es-CO"/>
+        </w:rPr>
+        <w:t xml:space="preserve">Cómo lo Soluciona el Patrón</w:t>
+      </w:r>
+      <w:r>
+        <w:rPr>
+          <w:lang w:val="es-CO"/>
+        </w:rPr>
+        <w:tab/>
+      </w:r>
+      <w:r>
+        <w:fldChar w:fldCharType="begin"/>
+      </w:r>
+      <w:r>
+        <w:rPr>
+          <w:lang w:val="es-CO"/>
+        </w:rPr>
+        <w:instrText>PAGEREF bm_builder_solucion \h</w:instrText>
+      </w:r>
+      <w:r>
+        <w:fldChar w:fldCharType="separate"/>
+      </w:r>
+      <w:r>
+        <w:rPr>
+          <w:noProof/>
+          <w:lang w:val="es-CO"/>
+        </w:rPr>
+        <w:t>1</w:t>
+      </w:r>
+      <w:r>
+        <w:fldChar w:fldCharType="end"/>
+      </w:r>
+    </w:p>
+    <w:p>
+      <w:pPr>
+        <w:tabs>
+          <w:tab w:val="right" w:leader="dot" w:pos="9360"/>
+        </w:tabs>
+        <w:spacing w:after="80" w:line="360" w:lineRule="auto"/>
+        <w:ind w:left="720"/>
+        <w:rPr>
+          <w:lang w:val="es-CO"/>
+        </w:rPr>
+      </w:pPr>
+      <w:r>
+        <w:rPr>
+          <w:i/>
+          <w:iCs/>
+          <w:lang w:val="es-CO"/>
+        </w:rPr>
+        <w:t xml:space="preserve">Qué Gana la Plataforma con Esto</w:t>
+      </w:r>
+      <w:r>
+        <w:rPr>
+          <w:lang w:val="es-CO"/>
+        </w:rPr>
+        <w:tab/>
+      </w:r>
+      <w:r>
+        <w:fldChar w:fldCharType="begin"/>
+      </w:r>
+      <w:r>
+        <w:rPr>
+          <w:lang w:val="es-CO"/>
+        </w:rPr>
+        <w:instrText>PAGEREF bm_builder_gana \h</w:instrText>
+      </w:r>
+      <w:r>
+        <w:fldChar w:fldCharType="separate"/>
+      </w:r>
+      <w:r>
+        <w:rPr>
+          <w:noProof/>
+          <w:lang w:val="es-CO"/>
+        </w:rPr>
+        <w:t>1</w:t>
+      </w:r>
+      <w:r>
+        <w:fldChar w:fldCharType="end"/>
+      </w:r>
+    </w:p>
+    <w:p>
+      <w:pPr>
+        <w:tabs>
+          <w:tab w:val="right" w:leader="dot" w:pos="9360"/>
+        </w:tabs>
+        <w:spacing w:after="80" w:line="360" w:lineRule="auto"/>
+        <w:ind w:left="720"/>
+        <w:rPr>
+          <w:lang w:val="es-CO"/>
+        </w:rPr>
+      </w:pPr>
+      <w:r>
+        <w:rPr>
+          <w:i/>
+          <w:iCs/>
+          <w:lang w:val="es-CO"/>
+        </w:rPr>
+        <w:t xml:space="preserve">Justificación de su Uso en el Proyecto</w:t>
+      </w:r>
+      <w:r>
+        <w:rPr>
+          <w:lang w:val="es-CO"/>
+        </w:rPr>
+        <w:tab/>
+      </w:r>
+      <w:r>
+        <w:fldChar w:fldCharType="begin"/>
+      </w:r>
+      <w:r>
+        <w:rPr>
+          <w:lang w:val="es-CO"/>
+        </w:rPr>
+        <w:instrText>PAGEREF bm_builder_justificacion \h</w:instrText>
+      </w:r>
+      <w:r>
+        <w:fldChar w:fldCharType="separate"/>
+      </w:r>
+      <w:r>
+        <w:rPr>
+          <w:noProof/>
+          <w:lang w:val="es-CO"/>
+        </w:rPr>
+        <w:t>1</w:t>
+      </w:r>
+      <w:r>
+        <w:fldChar w:fldCharType="end"/>
+      </w:r>
+    </w:p>
+    <w:p>
+      <w:pPr>
+        <w:tabs>
+          <w:tab w:val="right" w:leader="dot" w:pos="9360"/>
+        </w:tabs>
+        <w:spacing w:after="80" w:line="360" w:lineRule="auto"/>
+        <w:ind w:left="720"/>
+        <w:rPr>
+          <w:lang w:val="es-CO"/>
+        </w:rPr>
+      </w:pPr>
+      <w:r>
+        <w:rPr>
+          <w:i/>
+          <w:iCs/>
+          <w:lang w:val="es-CO"/>
+        </w:rPr>
+        <w:t xml:space="preserve">Validación del Patrón</w:t>
+      </w:r>
+      <w:r>
+        <w:rPr>
+          <w:lang w:val="es-CO"/>
+        </w:rPr>
+        <w:tab/>
+      </w:r>
+      <w:r>
+        <w:fldChar w:fldCharType="begin"/>
+      </w:r>
+      <w:r>
+        <w:rPr>
+          <w:lang w:val="es-CO"/>
+        </w:rPr>
+        <w:instrText>PAGEREF bm_builder_validacion \h</w:instrText>
+      </w:r>
+      <w:r>
+        <w:fldChar w:fldCharType="separate"/>
+      </w:r>
+      <w:r>
+        <w:rPr>
+          <w:noProof/>
+          <w:lang w:val="es-CO"/>
+        </w:rPr>
+        <w:t>1</w:t>
+      </w:r>
+      <w:r>
+        <w:fldChar w:fldCharType="end"/>
+      </w:r>
+    </w:p>
+    <w:p>
+      <w:pPr>
+        <w:tabs>
+          <w:tab w:val="right" w:leader="dot" w:pos="9360"/>
+        </w:tabs>
+        <w:spacing w:after="80" w:line="360" w:lineRule="auto"/>
         <w:ind w:left="720"/>
         <w:rPr>
           <w:lang w:val="es-CO"/>
@@ -2204,6 +2490,190 @@
     </w:p>
     <w:p>
       <w:pPr>
+        <w:tabs>
+          <w:tab w:val="right" w:leader="dot" w:pos="9360"/>
+        </w:tabs>
+        <w:spacing w:after="80" w:line="360" w:lineRule="auto"/>
+        <w:ind w:left="360" w:hanging="360"/>
+        <w:rPr>
+          <w:lang w:val="es-CO"/>
+        </w:rPr>
+      </w:pPr>
+      <w:r>
+        <w:rPr>
+          <w:lang w:val="es-CO"/>
+        </w:rPr>
+        <w:t xml:space="preserve">Figura 12. Builder abstracto ReporteBuilder y el director DirectorReportes en reportes.py</w:t>
+      </w:r>
+      <w:r>
+        <w:rPr>
+          <w:lang w:val="es-CO"/>
+        </w:rPr>
+        <w:tab/>
+      </w:r>
+      <w:r>
+        <w:fldChar w:fldCharType="begin"/>
+      </w:r>
+      <w:r>
+        <w:rPr>
+          <w:lang w:val="es-CO"/>
+        </w:rPr>
+        <w:instrText>PAGEREF bm_fig12 \h</w:instrText>
+      </w:r>
+      <w:r>
+        <w:fldChar w:fldCharType="separate"/>
+      </w:r>
+      <w:r>
+        <w:rPr>
+          <w:noProof/>
+          <w:lang w:val="es-CO"/>
+        </w:rPr>
+        <w:t>1</w:t>
+      </w:r>
+      <w:r>
+        <w:fldChar w:fldCharType="end"/>
+      </w:r>
+    </w:p>
+    <w:p>
+      <w:pPr>
+        <w:tabs>
+          <w:tab w:val="right" w:leader="dot" w:pos="9360"/>
+        </w:tabs>
+        <w:spacing w:after="80" w:line="360" w:lineRule="auto"/>
+        <w:ind w:left="360" w:hanging="360"/>
+        <w:rPr>
+          <w:lang w:val="es-CO"/>
+        </w:rPr>
+      </w:pPr>
+      <w:r>
+        <w:rPr>
+          <w:lang w:val="es-CO"/>
+        </w:rPr>
+        <w:t xml:space="preserve">Figura 13. Resultados de la ejecución de las pruebas unitarias del patrón Builder</w:t>
+      </w:r>
+      <w:r>
+        <w:rPr>
+          <w:lang w:val="es-CO"/>
+        </w:rPr>
+        <w:tab/>
+      </w:r>
+      <w:r>
+        <w:fldChar w:fldCharType="begin"/>
+      </w:r>
+      <w:r>
+        <w:rPr>
+          <w:lang w:val="es-CO"/>
+        </w:rPr>
+        <w:instrText>PAGEREF bm_fig13 \h</w:instrText>
+      </w:r>
+      <w:r>
+        <w:fldChar w:fldCharType="separate"/>
+      </w:r>
+      <w:r>
+        <w:rPr>
+          <w:noProof/>
+          <w:lang w:val="es-CO"/>
+        </w:rPr>
+        <w:t>1</w:t>
+      </w:r>
+      <w:r>
+        <w:fldChar w:fldCharType="end"/>
+      </w:r>
+    </w:p>
+    <w:p>
+      <w:pPr>
+        <w:tabs>
+          <w:tab w:val="right" w:leader="dot" w:pos="9360"/>
+        </w:tabs>
+        <w:spacing w:after="80" w:line="360" w:lineRule="auto"/>
+        <w:ind w:left="360" w:hanging="360"/>
+        <w:rPr>
+          <w:lang w:val="es-CO"/>
+        </w:rPr>
+      </w:pPr>
+      <w:r>
+        <w:rPr>
+          <w:lang w:val="es-CO"/>
+        </w:rPr>
+        <w:t xml:space="preserve">Figura 14. Documentación interactiva (Swagger) del endpoint de generación de reportes</w:t>
+      </w:r>
+      <w:r>
+        <w:rPr>
+          <w:lang w:val="es-CO"/>
+        </w:rPr>
+        <w:tab/>
+      </w:r>
+      <w:r>
+        <w:fldChar w:fldCharType="begin"/>
+      </w:r>
+      <w:r>
+        <w:rPr>
+          <w:lang w:val="es-CO"/>
+        </w:rPr>
+        <w:instrText>PAGEREF bm_fig14 \h</w:instrText>
+      </w:r>
+      <w:r>
+        <w:fldChar w:fldCharType="separate"/>
+      </w:r>
+      <w:r>
+        <w:rPr>
+          <w:noProof/>
+          <w:lang w:val="es-CO"/>
+        </w:rPr>
+        <w:t>1</w:t>
+      </w:r>
+      <w:r>
+        <w:fldChar w:fldCharType="end"/>
+      </w:r>
+    </w:p>
+    <w:p>
+      <w:pPr>
+        <w:tabs>
+          <w:tab w:val="right" w:leader="dot" w:pos="9360"/>
+        </w:tabs>
+        <w:spacing w:after="80" w:line="360" w:lineRule="auto"/>
+        <w:ind w:left="360" w:hanging="360"/>
+        <w:rPr>
+          <w:lang w:val="es-CO"/>
+        </w:rPr>
+      </w:pPr>
+      <w:r>
+        <w:rPr>
+          <w:lang w:val="es-CO"/>
+        </w:rPr>
+        <w:t xml:space="preserve">Figura 15. Interfaz de la plataforma generando un reporte energético en distintos formatos</w:t>
+      </w:r>
+      <w:r>
+        <w:rPr>
+          <w:lang w:val="es-CO"/>
+        </w:rPr>
+        <w:tab/>
+      </w:r>
+      <w:r>
+        <w:fldChar w:fldCharType="begin"/>
+      </w:r>
+      <w:r>
+        <w:rPr>
+          <w:lang w:val="es-CO"/>
+        </w:rPr>
+        <w:instrText>PAGEREF bm_fig15 \h</w:instrText>
+      </w:r>
+      <w:r>
+        <w:fldChar w:fldCharType="separate"/>
+      </w:r>
+      <w:r>
+        <w:rPr>
+          <w:noProof/>
+          <w:lang w:val="es-CO"/>
+        </w:rPr>
+        <w:t>1</w:t>
+      </w:r>
+      <w:r>
+        <w:fldChar w:fldCharType="end"/>
+      </w:r>
+    </w:p>
+    <w:p>
+      <w:pPr>
         <w:pageBreakBefore/>
         <w:rPr>
           <w:lang w:val="es-CO"/>
@@ -2243,7 +2713,7 @@
         <w:rPr>
           <w:lang w:val="es-CO"/>
         </w:rPr>
-        <w:t>El presente documento contextualiza el proyecto Plataforma de Comercio de Energía, una solución digital orientada a facilitar la compra y venta de excedentes energéticos entre usuarios en contextos de generación distribuida, como paneles solares domésticos y baterías inteligentes. Adicionalmente, se explica la implementación de tres patrones de diseño aplicados en el sistema: el patrón Singleton, que garantiza un punto único y consistente de acceso al estado de la plataforma (</w:t>
+        <w:t>El presente documento contextualiza el proyecto Plataforma de Comercio de Energía, una solución digital orientada a facilitar la compra y venta de excedentes energéticos entre usuarios en contextos de generación distribuida, como paneles solares domésticos y baterías inteligentes. Adicionalmente, se explica la implementación de cuatro patrones de diseño aplicados en el sistema: el patrón Singleton, que garantiza un punto único y consistente de acceso al estado de la plataforma (</w:t>
       </w:r>
       <w:proofErr w:type="spellStart"/>
       <w:r>
@@ -2271,7 +2741,7 @@
         <w:rPr>
           <w:lang w:val="es-CO"/>
         </w:rPr>
-        <w:t xml:space="preserve"> domésticos (paneles solares, baterías inteligentes y medidores), y el patrón Abstract Factory, que organiza los canales de notificación (correo, SMS y notificación push) para que cada uno genere la familia completa de avisos con un formato coherente. Se describe la problemática que motiva el proyecto, la propuesta de solución, las funcionalidades principales, el objetivo general y el impacto esperado, así como el problema técnico que motiva cada patrón, la solución propuesta a partir de las clases involucradas y los beneficios que aportan a la consistencia, la escalabilidad y la mantenibilidad del sistema.</w:t>
+        <w:t xml:space="preserve"> domésticos (paneles solares, baterías inteligentes y medidores); el patrón Abstract Factory, que organiza los canales de notificación (correo, SMS y notificación push) para que cada uno genere la familia completa de avisos con un formato coherente; y el patrón Builder, que construye el reporte energético del usuario paso a paso para obtenerlo en distintas representaciones (diccionario, objeto con secciones o texto). Se describe la problemática que motiva el proyecto, la propuesta de solución, las funcionalidades principales, el objetivo general y el impacto esperado, así como el problema técnico que motiva cada patrón, la solución propuesta a partir de las clases involucradas y los beneficios que aportan a la consistencia, la escalabilidad y la mantenibilidad del sistema.</w:t>
       </w:r>
     </w:p>
     <w:p>
@@ -2293,7 +2763,7 @@
         <w:rPr>
           <w:lang w:val="es-CO"/>
         </w:rPr>
-        <w:t xml:space="preserve">comercio de energía, Singleton, Factory Method, Abstract Factory, patrones de diseño, </w:t>
+        <w:t xml:space="preserve">comercio de energía, Singleton, Factory Method, Abstract Factory, Builder, patrones de diseño, </w:t>
       </w:r>
       <w:proofErr w:type="spellStart"/>
       <w:r>
@@ -9017,13 +9487,50 @@
     </w:p>
     <w:p>
       <w:pPr>
+        <w:pStyle w:val="Ttulo2"/>
+        <w:spacing w:before="240" w:after="120" w:line="480" w:lineRule="auto"/>
+        <w:rPr>
+          <w:lang w:val="es-CO"/>
+        </w:rPr>
+      </w:pPr>
+      <w:bookmarkStart w:id="40" w:name="bm_builder"/>
+      <w:r>
+        <w:rPr>
+          <w:b/>
+          <w:bCs/>
+          <w:color w:val="000000"/>
+          <w:sz w:val="24"/>
+          <w:szCs w:val="24"/>
+          <w:lang w:val="es-CO"/>
+        </w:rPr>
+        <w:t xml:space="preserve">Aplicación del Patrón de Diseño Builder en la Generación de Reportes Energéticos</w:t>
+      </w:r>
+      <w:bookmarkEnd w:id="40"/>
+    </w:p>
+    <w:p>
+      <w:pPr>
+        <w:spacing w:line="480" w:lineRule="auto"/>
+        <w:jc w:val="both"/>
+        <w:rPr>
+          <w:lang w:val="es-CO"/>
+        </w:rPr>
+      </w:pPr>
+      <w:r>
+        <w:rPr>
+          <w:lang w:val="es-CO"/>
+        </w:rPr>
+        <w:t xml:space="preserve">El patrón Builder incorporado a la plataforma resuelve la manera en que se construye el reporte energético de cada usuario: el documento que resume, para un período dado, su balance de producción y consumo, el desglose por dispositivo IoT, el historial de operaciones en la subasta y la predicción de la próxima lectura de cada dispositivo. Este módulo forma parte de la lógica de dominio del backend (reportes.py) y es consumido por la clase PlataformaEnergia y por la API FastAPI (main.py).</w:t>
+      </w:r>
+    </w:p>
+    <w:p>
+      <w:pPr>
         <w:pStyle w:val="Ttulo3"/>
         <w:spacing w:before="200" w:after="100" w:line="480" w:lineRule="auto"/>
         <w:rPr>
           <w:lang w:val="es-CO"/>
         </w:rPr>
       </w:pPr>
-      <w:bookmarkStart w:id="27" w:name="bm_factory_conclusion"/>
+      <w:bookmarkStart w:id="41" w:name="bm_builder_problema"/>
       <w:r>
         <w:rPr>
           <w:b/>
@@ -9033,6 +9540,1224 @@
           <w:color w:val="000000"/>
           <w:lang w:val="es-CO"/>
         </w:rPr>
+        <w:t xml:space="preserve">El Problema que Resuelve</w:t>
+      </w:r>
+      <w:bookmarkEnd w:id="41"/>
+    </w:p>
+    <w:p>
+      <w:pPr>
+        <w:spacing w:line="480" w:lineRule="auto"/>
+        <w:jc w:val="both"/>
+        <w:rPr>
+          <w:lang w:val="es-CO"/>
+        </w:rPr>
+      </w:pPr>
+      <w:r>
+        <w:rPr>
+          <w:lang w:val="es-CO"/>
+        </w:rPr>
+        <w:t xml:space="preserve">El reporte energético no es un objeto simple. Por un lado, tiene muchas partes opcionales: el resumen ejecutivo solo lleva el balance y el número de operaciones; el reporte completo añade el desglose por dispositivo y la predicción; el reporte pensado para adjuntar a una factura lleva el historial de operaciones y el balance, pero no la predicción. Por otro lado, debe existir en varias representaciones: el canal de notificación (patrón Abstract Factory) necesita un diccionario plano con unas claves concretas; el panel web necesita un objeto con secciones tipadas; un correo o un archivo de texto necesitan una cadena ya formateada.</w:t>
+      </w:r>
+    </w:p>
+    <w:p>
+      <w:pPr>
+        <w:spacing w:line="480" w:lineRule="auto"/>
+        <w:jc w:val="both"/>
+        <w:rPr>
+          <w:lang w:val="es-CO"/>
+        </w:rPr>
+      </w:pPr>
+      <w:r>
+        <w:rPr>
+          <w:lang w:val="es-CO"/>
+        </w:rPr>
+        <w:t xml:space="preserve">Sin este patrón, el método que genera el reporte tendría que decidir con condicionales qué secciones incluir y, además, saber serializar el resultado a cada formato, mezclando la lógica de negocio con la de presentación:</w:t>
+      </w:r>
+    </w:p>
+    <w:p>
+      <w:pPr>
+        <w:ind w:left="720"/>
+        <w:rPr>
+          <w:lang w:val="es-CO"/>
+        </w:rPr>
+      </w:pPr>
+      <w:r>
+        <w:rPr>
+          <w:rFonts w:ascii="Courier New" w:eastAsia="Courier New" w:hAnsi="Courier New" w:cs="Courier New"/>
+          <w:sz w:val="20"/>
+          <w:szCs w:val="20"/>
+          <w:lang w:val="es-CO"/>
+        </w:rPr>
+        <w:t xml:space="preserve">if tipo == "completo":</w:t>
+      </w:r>
+    </w:p>
+    <w:p>
+      <w:pPr>
+        <w:ind w:left="720"/>
+        <w:rPr>
+          <w:lang w:val="es-CO"/>
+        </w:rPr>
+      </w:pPr>
+      <w:r>
+        <w:rPr>
+          <w:rFonts w:ascii="Courier New" w:eastAsia="Courier New" w:hAnsi="Courier New" w:cs="Courier New"/>
+          <w:sz w:val="20"/>
+          <w:szCs w:val="20"/>
+          <w:lang w:val="es-CO"/>
+        </w:rPr>
+        <w:t xml:space="preserve">    secciones = [balance, desglose, historial, prediccion]</w:t>
+      </w:r>
+    </w:p>
+    <w:p>
+      <w:pPr>
+        <w:ind w:left="720"/>
+        <w:rPr>
+          <w:lang w:val="es-CO"/>
+        </w:rPr>
+      </w:pPr>
+      <w:r>
+        <w:rPr>
+          <w:rFonts w:ascii="Courier New" w:eastAsia="Courier New" w:hAnsi="Courier New" w:cs="Courier New"/>
+          <w:sz w:val="20"/>
+          <w:szCs w:val="20"/>
+          <w:lang w:val="es-CO"/>
+        </w:rPr>
+        <w:t xml:space="preserve">elif tipo == "ejecutivo":</w:t>
+      </w:r>
+    </w:p>
+    <w:p>
+      <w:pPr>
+        <w:ind w:left="720"/>
+        <w:rPr>
+          <w:lang w:val="es-CO"/>
+        </w:rPr>
+      </w:pPr>
+      <w:r>
+        <w:rPr>
+          <w:rFonts w:ascii="Courier New" w:eastAsia="Courier New" w:hAnsi="Courier New" w:cs="Courier New"/>
+          <w:sz w:val="20"/>
+          <w:szCs w:val="20"/>
+          <w:lang w:val="es-CO"/>
+        </w:rPr>
+        <w:t xml:space="preserve">    secciones = [balance, historial]</w:t>
+      </w:r>
+    </w:p>
+    <w:p>
+      <w:pPr>
+        <w:ind w:left="720"/>
+        <w:rPr>
+          <w:lang w:val="es-CO"/>
+        </w:rPr>
+      </w:pPr>
+      <w:r>
+        <w:rPr>
+          <w:rFonts w:ascii="Courier New" w:eastAsia="Courier New" w:hAnsi="Courier New" w:cs="Courier New"/>
+          <w:sz w:val="20"/>
+          <w:szCs w:val="20"/>
+          <w:lang w:val="es-CO"/>
+        </w:rPr>
+        <w:t xml:space="preserve"> </w:t>
+      </w:r>
+    </w:p>
+    <w:p>
+      <w:pPr>
+        <w:ind w:left="720"/>
+        <w:rPr>
+          <w:lang w:val="es-CO"/>
+        </w:rPr>
+      </w:pPr>
+      <w:r>
+        <w:rPr>
+          <w:rFonts w:ascii="Courier New" w:eastAsia="Courier New" w:hAnsi="Courier New" w:cs="Courier New"/>
+          <w:sz w:val="20"/>
+          <w:szCs w:val="20"/>
+          <w:lang w:val="es-CO"/>
+        </w:rPr>
+        <w:t xml:space="preserve">if formato == "dict":</w:t>
+      </w:r>
+    </w:p>
+    <w:p>
+      <w:pPr>
+        <w:ind w:left="720"/>
+        <w:rPr>
+          <w:lang w:val="es-CO"/>
+        </w:rPr>
+      </w:pPr>
+      <w:r>
+        <w:rPr>
+          <w:rFonts w:ascii="Courier New" w:eastAsia="Courier New" w:hAnsi="Courier New" w:cs="Courier New"/>
+          <w:sz w:val="20"/>
+          <w:szCs w:val="20"/>
+          <w:lang w:val="es-CO"/>
+        </w:rPr>
+        <w:t xml:space="preserve">    return {"usuario": ..., "balance_kwh": ...}</w:t>
+      </w:r>
+    </w:p>
+    <w:p>
+      <w:pPr>
+        <w:ind w:left="720"/>
+        <w:rPr>
+          <w:lang w:val="es-CO"/>
+        </w:rPr>
+      </w:pPr>
+      <w:r>
+        <w:rPr>
+          <w:rFonts w:ascii="Courier New" w:eastAsia="Courier New" w:hAnsi="Courier New" w:cs="Courier New"/>
+          <w:sz w:val="20"/>
+          <w:szCs w:val="20"/>
+          <w:lang w:val="es-CO"/>
+        </w:rPr>
+        <w:t xml:space="preserve">elif formato == "texto":</w:t>
+      </w:r>
+    </w:p>
+    <w:p>
+      <w:pPr>
+        <w:ind w:left="720"/>
+        <w:rPr>
+          <w:lang w:val="es-CO"/>
+        </w:rPr>
+      </w:pPr>
+      <w:r>
+        <w:rPr>
+          <w:rFonts w:ascii="Courier New" w:eastAsia="Courier New" w:hAnsi="Courier New" w:cs="Courier New"/>
+          <w:sz w:val="20"/>
+          <w:szCs w:val="20"/>
+          <w:lang w:val="es-CO"/>
+        </w:rPr>
+        <w:t xml:space="preserve">    return "\n".join(lineas)</w:t>
+      </w:r>
+    </w:p>
+    <w:p>
+      <w:pPr>
+        <w:spacing w:line="480" w:lineRule="auto"/>
+        <w:jc w:val="both"/>
+        <w:rPr>
+          <w:lang w:val="es-CO"/>
+        </w:rPr>
+      </w:pPr>
+      <w:r>
+        <w:rPr>
+          <w:lang w:val="es-CO"/>
+        </w:rPr>
+        <w:t xml:space="preserve">Esa mezcla obliga a tocar el mismo método cada vez que se agrega una sección o un formato de salida nuevo, y hace difícil garantizar que el diccionario que se envía por el canal de notificación siga teniendo las claves que este espera.</w:t>
+      </w:r>
+    </w:p>
+    <w:p>
+      <w:pPr>
+        <w:pStyle w:val="Ttulo3"/>
+        <w:spacing w:before="200" w:after="100" w:line="480" w:lineRule="auto"/>
+        <w:rPr>
+          <w:lang w:val="es-CO"/>
+        </w:rPr>
+      </w:pPr>
+      <w:bookmarkStart w:id="42" w:name="bm_builder_solucion"/>
+      <w:r>
+        <w:rPr>
+          <w:b/>
+          <w:bCs/>
+          <w:i/>
+          <w:iCs/>
+          <w:color w:val="000000"/>
+          <w:lang w:val="es-CO"/>
+        </w:rPr>
+        <w:t xml:space="preserve">Cómo lo Soluciona el Patrón</w:t>
+      </w:r>
+      <w:bookmarkEnd w:id="42"/>
+    </w:p>
+    <w:p>
+      <w:pPr>
+        <w:pStyle w:val="Prrafodelista"/>
+        <w:numPr>
+          <w:ilvl w:val="0"/>
+          <w:numId w:val="2"/>
+        </w:numPr>
+        <w:spacing w:line="480" w:lineRule="auto"/>
+        <w:jc w:val="both"/>
+        <w:rPr>
+          <w:lang w:val="es-CO"/>
+        </w:rPr>
+      </w:pPr>
+      <w:r>
+        <w:rPr>
+          <w:b/>
+          <w:bCs/>
+          <w:lang w:val="es-CO"/>
+        </w:rPr>
+        <w:t xml:space="preserve">Builder abstracto. </w:t>
+      </w:r>
+      <w:r>
+        <w:rPr>
+          <w:lang w:val="es-CO"/>
+        </w:rPr>
+        <w:t xml:space="preserve">ReporteBuilder declara los pasos de construcción —encabezado(), balance_energetico(), desglose_dispositivos(), historial_transacciones() y prediccion_consumo()— y un método obtener_reporte() que entrega el producto terminado. Cada paso devuelve el propio builder, de modo que se pueden encadenar.</w:t>
+      </w:r>
+    </w:p>
+    <w:p>
+      <w:pPr>
+        <w:pStyle w:val="Prrafodelista"/>
+        <w:numPr>
+          <w:ilvl w:val="0"/>
+          <w:numId w:val="2"/>
+        </w:numPr>
+        <w:spacing w:line="480" w:lineRule="auto"/>
+        <w:jc w:val="both"/>
+        <w:rPr>
+          <w:lang w:val="es-CO"/>
+        </w:rPr>
+      </w:pPr>
+      <w:r>
+        <w:rPr>
+          <w:b/>
+          <w:bCs/>
+          <w:lang w:val="es-CO"/>
+        </w:rPr>
+        <w:t xml:space="preserve">Builders concretos. </w:t>
+      </w:r>
+      <w:r>
+        <w:rPr>
+          <w:lang w:val="es-CO"/>
+        </w:rPr>
+        <w:t xml:space="preserve">Cada uno produce una representación distinta con esos mismos pasos: ReporteResumenBuilder devuelve un diccionario plano (el que consume el FormateadorReporte del Abstract Factory), ReporteDetalladoBuilder devuelve un objeto ReporteEnergetico con una sección por paso, y ReporteTextoBuilder devuelve una cadena de texto ya formateada.</w:t>
+      </w:r>
+    </w:p>
+    <w:p>
+      <w:pPr>
+        <w:pStyle w:val="Prrafodelista"/>
+        <w:numPr>
+          <w:ilvl w:val="0"/>
+          <w:numId w:val="2"/>
+        </w:numPr>
+        <w:spacing w:line="480" w:lineRule="auto"/>
+        <w:jc w:val="both"/>
+        <w:rPr>
+          <w:lang w:val="es-CO"/>
+        </w:rPr>
+      </w:pPr>
+      <w:r>
+        <w:rPr>
+          <w:b/>
+          <w:bCs/>
+          <w:lang w:val="es-CO"/>
+        </w:rPr>
+        <w:t xml:space="preserve">Director. </w:t>
+      </w:r>
+      <w:r>
+        <w:rPr>
+          <w:lang w:val="es-CO"/>
+        </w:rPr>
+        <w:t xml:space="preserve">DirectorReportes conoce las recetas: en qué orden y con qué pasos se arma un reporte ejecutivo, uno completo o uno para factura. Llama los pasos del builder que tenga configurado; nunca sabe qué representación produce.</w:t>
+      </w:r>
+    </w:p>
+    <w:p>
+      <w:pPr>
+        <w:pStyle w:val="Prrafodelista"/>
+        <w:numPr>
+          <w:ilvl w:val="0"/>
+          <w:numId w:val="2"/>
+        </w:numPr>
+        <w:spacing w:line="480" w:lineRule="auto"/>
+        <w:jc w:val="both"/>
+        <w:rPr>
+          <w:lang w:val="es-CO"/>
+        </w:rPr>
+      </w:pPr>
+      <w:r>
+        <w:rPr>
+          <w:b/>
+          <w:bCs/>
+          <w:lang w:val="es-CO"/>
+        </w:rPr>
+        <w:t xml:space="preserve">Datos de entrada. </w:t>
+      </w:r>
+      <w:r>
+        <w:rPr>
+          <w:lang w:val="es-CO"/>
+        </w:rPr>
+        <w:t xml:space="preserve">DatosReporte reúne la materia prima ya calculada por la plataforma (producción, consumo, lecturas por dispositivo, transacciones y predicciones). El builder solo le da forma; no consulta ni calcula nada.</w:t>
+      </w:r>
+    </w:p>
+    <w:p>
+      <w:pPr>
+        <w:pStyle w:val="Prrafodelista"/>
+        <w:numPr>
+          <w:ilvl w:val="0"/>
+          <w:numId w:val="2"/>
+        </w:numPr>
+        <w:spacing w:line="480" w:lineRule="auto"/>
+        <w:jc w:val="both"/>
+        <w:rPr>
+          <w:lang w:val="es-CO"/>
+        </w:rPr>
+      </w:pPr>
+      <w:r>
+        <w:rPr>
+          <w:b/>
+          <w:bCs/>
+          <w:lang w:val="es-CO"/>
+        </w:rPr>
+        <w:t xml:space="preserve">Punto único de resolución. </w:t>
+      </w:r>
+      <w:r>
+        <w:rPr>
+          <w:lang w:val="es-CO"/>
+        </w:rPr>
+        <w:t xml:space="preserve">La función crear_builder(formato) traduce el formato solicitado al builder correspondiente; un formato no soportado produce un ValueError con la lista de formatos válidos.</w:t>
+      </w:r>
+    </w:p>
+    <w:p>
+      <w:pPr>
+        <w:spacing w:before="200" w:line="480" w:lineRule="auto"/>
+        <w:rPr>
+          <w:lang w:val="es-CO"/>
+        </w:rPr>
+      </w:pPr>
+      <w:bookmarkStart w:id="43" w:name="bm_fig12"/>
+      <w:r>
+        <w:rPr>
+          <w:b/>
+          <w:bCs/>
+          <w:lang w:val="es-CO"/>
+        </w:rPr>
+        <w:t xml:space="preserve">Figura 12</w:t>
+      </w:r>
+      <w:bookmarkEnd w:id="43"/>
+    </w:p>
+    <w:p>
+      <w:pPr>
+        <w:spacing w:line="480" w:lineRule="auto"/>
+        <w:rPr>
+          <w:lang w:val="es-CO"/>
+        </w:rPr>
+      </w:pPr>
+      <w:r>
+        <w:rPr>
+          <w:i/>
+          <w:iCs/>
+          <w:lang w:val="es-CO"/>
+        </w:rPr>
+        <w:t xml:space="preserve">Builder abstracto ReporteBuilder y el director DirectorReportes en reportes.py</w:t>
+      </w:r>
+    </w:p>
+    <w:p>
+      <w:pPr>
+        <w:ind w:left="720"/>
+        <w:rPr>
+          <w:lang w:val="es-CO"/>
+        </w:rPr>
+      </w:pPr>
+      <w:r>
+        <w:rPr>
+          <w:rFonts w:ascii="Courier New" w:eastAsia="Courier New" w:hAnsi="Courier New" w:cs="Courier New"/>
+          <w:sz w:val="20"/>
+          <w:szCs w:val="20"/>
+          <w:lang w:val="es-CO"/>
+        </w:rPr>
+        <w:t xml:space="preserve">class ReporteBuilder(ABC):</w:t>
+      </w:r>
+    </w:p>
+    <w:p>
+      <w:pPr>
+        <w:ind w:left="720"/>
+        <w:rPr>
+          <w:lang w:val="es-CO"/>
+        </w:rPr>
+      </w:pPr>
+      <w:r>
+        <w:rPr>
+          <w:rFonts w:ascii="Courier New" w:eastAsia="Courier New" w:hAnsi="Courier New" w:cs="Courier New"/>
+          <w:sz w:val="20"/>
+          <w:szCs w:val="20"/>
+          <w:lang w:val="es-CO"/>
+        </w:rPr>
+        <w:t xml:space="preserve">    @abstractmethod</w:t>
+      </w:r>
+    </w:p>
+    <w:p>
+      <w:pPr>
+        <w:ind w:left="720"/>
+        <w:rPr>
+          <w:lang w:val="es-CO"/>
+        </w:rPr>
+      </w:pPr>
+      <w:r>
+        <w:rPr>
+          <w:rFonts w:ascii="Courier New" w:eastAsia="Courier New" w:hAnsi="Courier New" w:cs="Courier New"/>
+          <w:sz w:val="20"/>
+          <w:szCs w:val="20"/>
+          <w:lang w:val="es-CO"/>
+        </w:rPr>
+        <w:t xml:space="preserve">    def encabezado(self, usuario, periodo) -&gt; "ReporteBuilder": ...</w:t>
+      </w:r>
+    </w:p>
+    <w:p>
+      <w:pPr>
+        <w:ind w:left="720"/>
+        <w:rPr>
+          <w:lang w:val="es-CO"/>
+        </w:rPr>
+      </w:pPr>
+      <w:r>
+        <w:rPr>
+          <w:rFonts w:ascii="Courier New" w:eastAsia="Courier New" w:hAnsi="Courier New" w:cs="Courier New"/>
+          <w:sz w:val="20"/>
+          <w:szCs w:val="20"/>
+          <w:lang w:val="es-CO"/>
+        </w:rPr>
+        <w:t xml:space="preserve">    @abstractmethod</w:t>
+      </w:r>
+    </w:p>
+    <w:p>
+      <w:pPr>
+        <w:ind w:left="720"/>
+        <w:rPr>
+          <w:lang w:val="es-CO"/>
+        </w:rPr>
+      </w:pPr>
+      <w:r>
+        <w:rPr>
+          <w:rFonts w:ascii="Courier New" w:eastAsia="Courier New" w:hAnsi="Courier New" w:cs="Courier New"/>
+          <w:sz w:val="20"/>
+          <w:szCs w:val="20"/>
+          <w:lang w:val="es-CO"/>
+        </w:rPr>
+        <w:t xml:space="preserve">    def balance_energetico(self, produccion_kwh, consumo_kwh) -&gt; "ReporteBuilder": ...</w:t>
+      </w:r>
+    </w:p>
+    <w:p>
+      <w:pPr>
+        <w:ind w:left="720"/>
+        <w:rPr>
+          <w:lang w:val="es-CO"/>
+        </w:rPr>
+      </w:pPr>
+      <w:r>
+        <w:rPr>
+          <w:rFonts w:ascii="Courier New" w:eastAsia="Courier New" w:hAnsi="Courier New" w:cs="Courier New"/>
+          <w:sz w:val="20"/>
+          <w:szCs w:val="20"/>
+          <w:lang w:val="es-CO"/>
+        </w:rPr>
+        <w:t xml:space="preserve">    # ... desglose_dispositivos, historial_transacciones, prediccion_consumo</w:t>
+      </w:r>
+    </w:p>
+    <w:p>
+      <w:pPr>
+        <w:ind w:left="720"/>
+        <w:rPr>
+          <w:lang w:val="es-CO"/>
+        </w:rPr>
+      </w:pPr>
+      <w:r>
+        <w:rPr>
+          <w:rFonts w:ascii="Courier New" w:eastAsia="Courier New" w:hAnsi="Courier New" w:cs="Courier New"/>
+          <w:sz w:val="20"/>
+          <w:szCs w:val="20"/>
+          <w:lang w:val="es-CO"/>
+        </w:rPr>
+        <w:t xml:space="preserve">    @abstractmethod</w:t>
+      </w:r>
+    </w:p>
+    <w:p>
+      <w:pPr>
+        <w:ind w:left="720"/>
+        <w:rPr>
+          <w:lang w:val="es-CO"/>
+        </w:rPr>
+      </w:pPr>
+      <w:r>
+        <w:rPr>
+          <w:rFonts w:ascii="Courier New" w:eastAsia="Courier New" w:hAnsi="Courier New" w:cs="Courier New"/>
+          <w:sz w:val="20"/>
+          <w:szCs w:val="20"/>
+          <w:lang w:val="es-CO"/>
+        </w:rPr>
+        <w:t xml:space="preserve">    def obtener_reporte(self): ...</w:t>
+      </w:r>
+    </w:p>
+    <w:p>
+      <w:pPr>
+        <w:ind w:left="720"/>
+        <w:rPr>
+          <w:lang w:val="es-CO"/>
+        </w:rPr>
+      </w:pPr>
+      <w:r>
+        <w:rPr>
+          <w:rFonts w:ascii="Courier New" w:eastAsia="Courier New" w:hAnsi="Courier New" w:cs="Courier New"/>
+          <w:sz w:val="20"/>
+          <w:szCs w:val="20"/>
+          <w:lang w:val="es-CO"/>
+        </w:rPr>
+        <w:t xml:space="preserve"> </w:t>
+      </w:r>
+    </w:p>
+    <w:p>
+      <w:pPr>
+        <w:ind w:left="720"/>
+        <w:rPr>
+          <w:lang w:val="es-CO"/>
+        </w:rPr>
+      </w:pPr>
+      <w:r>
+        <w:rPr>
+          <w:rFonts w:ascii="Courier New" w:eastAsia="Courier New" w:hAnsi="Courier New" w:cs="Courier New"/>
+          <w:sz w:val="20"/>
+          <w:szCs w:val="20"/>
+          <w:lang w:val="es-CO"/>
+        </w:rPr>
+        <w:t xml:space="preserve"> </w:t>
+      </w:r>
+    </w:p>
+    <w:p>
+      <w:pPr>
+        <w:ind w:left="720"/>
+        <w:rPr>
+          <w:lang w:val="es-CO"/>
+        </w:rPr>
+      </w:pPr>
+      <w:r>
+        <w:rPr>
+          <w:rFonts w:ascii="Courier New" w:eastAsia="Courier New" w:hAnsi="Courier New" w:cs="Courier New"/>
+          <w:sz w:val="20"/>
+          <w:szCs w:val="20"/>
+          <w:lang w:val="es-CO"/>
+        </w:rPr>
+        <w:t xml:space="preserve">class DirectorReportes:</w:t>
+      </w:r>
+    </w:p>
+    <w:p>
+      <w:pPr>
+        <w:ind w:left="720"/>
+        <w:rPr>
+          <w:lang w:val="es-CO"/>
+        </w:rPr>
+      </w:pPr>
+      <w:r>
+        <w:rPr>
+          <w:rFonts w:ascii="Courier New" w:eastAsia="Courier New" w:hAnsi="Courier New" w:cs="Courier New"/>
+          <w:sz w:val="20"/>
+          <w:szCs w:val="20"/>
+          <w:lang w:val="es-CO"/>
+        </w:rPr>
+        <w:t xml:space="preserve">    def reporte_completo(self, datos: DatosReporte):</w:t>
+      </w:r>
+    </w:p>
+    <w:p>
+      <w:pPr>
+        <w:ind w:left="720"/>
+        <w:rPr>
+          <w:lang w:val="es-CO"/>
+        </w:rPr>
+      </w:pPr>
+      <w:r>
+        <w:rPr>
+          <w:rFonts w:ascii="Courier New" w:eastAsia="Courier New" w:hAnsi="Courier New" w:cs="Courier New"/>
+          <w:sz w:val="20"/>
+          <w:szCs w:val="20"/>
+          <w:lang w:val="es-CO"/>
+        </w:rPr>
+        <w:t xml:space="preserve">        b = self._builder</w:t>
+      </w:r>
+    </w:p>
+    <w:p>
+      <w:pPr>
+        <w:ind w:left="720"/>
+        <w:rPr>
+          <w:lang w:val="es-CO"/>
+        </w:rPr>
+      </w:pPr>
+      <w:r>
+        <w:rPr>
+          <w:rFonts w:ascii="Courier New" w:eastAsia="Courier New" w:hAnsi="Courier New" w:cs="Courier New"/>
+          <w:sz w:val="20"/>
+          <w:szCs w:val="20"/>
+          <w:lang w:val="es-CO"/>
+        </w:rPr>
+        <w:t xml:space="preserve">        b.reiniciar()</w:t>
+      </w:r>
+    </w:p>
+    <w:p>
+      <w:pPr>
+        <w:ind w:left="720"/>
+        <w:rPr>
+          <w:lang w:val="es-CO"/>
+        </w:rPr>
+      </w:pPr>
+      <w:r>
+        <w:rPr>
+          <w:rFonts w:ascii="Courier New" w:eastAsia="Courier New" w:hAnsi="Courier New" w:cs="Courier New"/>
+          <w:sz w:val="20"/>
+          <w:szCs w:val="20"/>
+          <w:lang w:val="es-CO"/>
+        </w:rPr>
+        <w:t xml:space="preserve">        b.encabezado(datos.usuario, datos.periodo)</w:t>
+      </w:r>
+    </w:p>
+    <w:p>
+      <w:pPr>
+        <w:ind w:left="720"/>
+        <w:rPr>
+          <w:lang w:val="es-CO"/>
+        </w:rPr>
+      </w:pPr>
+      <w:r>
+        <w:rPr>
+          <w:rFonts w:ascii="Courier New" w:eastAsia="Courier New" w:hAnsi="Courier New" w:cs="Courier New"/>
+          <w:sz w:val="20"/>
+          <w:szCs w:val="20"/>
+          <w:lang w:val="es-CO"/>
+        </w:rPr>
+        <w:t xml:space="preserve">        b.balance_energetico(datos.produccion_kwh, datos.consumo_kwh)</w:t>
+      </w:r>
+    </w:p>
+    <w:p>
+      <w:pPr>
+        <w:ind w:left="720"/>
+        <w:rPr>
+          <w:lang w:val="es-CO"/>
+        </w:rPr>
+      </w:pPr>
+      <w:r>
+        <w:rPr>
+          <w:rFonts w:ascii="Courier New" w:eastAsia="Courier New" w:hAnsi="Courier New" w:cs="Courier New"/>
+          <w:sz w:val="20"/>
+          <w:szCs w:val="20"/>
+          <w:lang w:val="es-CO"/>
+        </w:rPr>
+        <w:t xml:space="preserve">        b.desglose_dispositivos(datos.lecturas_por_dispositivo)</w:t>
+      </w:r>
+    </w:p>
+    <w:p>
+      <w:pPr>
+        <w:ind w:left="720"/>
+        <w:rPr>
+          <w:lang w:val="es-CO"/>
+        </w:rPr>
+      </w:pPr>
+      <w:r>
+        <w:rPr>
+          <w:rFonts w:ascii="Courier New" w:eastAsia="Courier New" w:hAnsi="Courier New" w:cs="Courier New"/>
+          <w:sz w:val="20"/>
+          <w:szCs w:val="20"/>
+          <w:lang w:val="es-CO"/>
+        </w:rPr>
+        <w:t xml:space="preserve">        b.historial_transacciones(datos.transacciones)</w:t>
+      </w:r>
+    </w:p>
+    <w:p>
+      <w:pPr>
+        <w:ind w:left="720"/>
+        <w:rPr>
+          <w:lang w:val="es-CO"/>
+        </w:rPr>
+      </w:pPr>
+      <w:r>
+        <w:rPr>
+          <w:rFonts w:ascii="Courier New" w:eastAsia="Courier New" w:hAnsi="Courier New" w:cs="Courier New"/>
+          <w:sz w:val="20"/>
+          <w:szCs w:val="20"/>
+          <w:lang w:val="es-CO"/>
+        </w:rPr>
+        <w:t xml:space="preserve">        b.prediccion_consumo(datos.prediccion_por_dispositivo)</w:t>
+      </w:r>
+    </w:p>
+    <w:p>
+      <w:pPr>
+        <w:ind w:left="720"/>
+        <w:rPr>
+          <w:lang w:val="es-CO"/>
+        </w:rPr>
+      </w:pPr>
+      <w:r>
+        <w:rPr>
+          <w:rFonts w:ascii="Courier New" w:eastAsia="Courier New" w:hAnsi="Courier New" w:cs="Courier New"/>
+          <w:sz w:val="20"/>
+          <w:szCs w:val="20"/>
+          <w:lang w:val="es-CO"/>
+        </w:rPr>
+        <w:t xml:space="preserve">        return b.obtener_reporte()</w:t>
+      </w:r>
+    </w:p>
+    <w:p>
+      <w:pPr>
+        <w:spacing w:before="120" w:line="480" w:lineRule="auto"/>
+        <w:rPr>
+          <w:lang w:val="es-CO"/>
+        </w:rPr>
+      </w:pPr>
+      <w:r>
+        <w:rPr>
+          <w:i/>
+          <w:iCs/>
+          <w:lang w:val="es-CO"/>
+        </w:rPr>
+        <w:t xml:space="preserve">Nota. </w:t>
+      </w:r>
+      <w:r>
+        <w:rPr>
+          <w:lang w:val="es-CO"/>
+        </w:rPr>
+        <w:t xml:space="preserve">Extracto de backend/reportes.py. El director ejecuta siempre la misma secuencia de pasos; el tipo de objeto que devuelve obtener_reporte() depende del builder concreto que se le haya pasado (ReporteResumenBuilder, ReporteDetalladoBuilder o ReporteTextoBuilder).</w:t>
+      </w:r>
+    </w:p>
+    <w:p>
+      <w:pPr>
+        <w:pStyle w:val="Ttulo3"/>
+        <w:spacing w:before="200" w:after="100" w:line="480" w:lineRule="auto"/>
+        <w:rPr>
+          <w:lang w:val="es-CO"/>
+        </w:rPr>
+      </w:pPr>
+      <w:bookmarkStart w:id="44" w:name="bm_builder_gana"/>
+      <w:r>
+        <w:rPr>
+          <w:b/>
+          <w:bCs/>
+          <w:i/>
+          <w:iCs/>
+          <w:color w:val="000000"/>
+          <w:lang w:val="es-CO"/>
+        </w:rPr>
+        <w:t xml:space="preserve">Qué Gana la Plataforma con Esto</w:t>
+      </w:r>
+      <w:bookmarkEnd w:id="44"/>
+    </w:p>
+    <w:p>
+      <w:pPr>
+        <w:spacing w:line="480" w:lineRule="auto"/>
+        <w:jc w:val="both"/>
+        <w:rPr>
+          <w:lang w:val="es-CO"/>
+        </w:rPr>
+      </w:pPr>
+      <w:r>
+        <w:rPr>
+          <w:b/>
+          <w:bCs/>
+          <w:lang w:val="es-CO"/>
+        </w:rPr>
+        <w:t xml:space="preserve">Separación entre construcción, receta y representación. </w:t>
+      </w:r>
+      <w:r>
+        <w:rPr>
+          <w:lang w:val="es-CO"/>
+        </w:rPr>
+        <w:t xml:space="preserve">La plataforma decide qué datos entran al reporte; el director decide qué secciones y en qué orden; el builder decide en qué formato sale. Cada uno de esos tres ejes cambia por separado.</w:t>
+      </w:r>
+    </w:p>
+    <w:p>
+      <w:pPr>
+        <w:spacing w:line="480" w:lineRule="auto"/>
+        <w:jc w:val="both"/>
+        <w:rPr>
+          <w:lang w:val="es-CO"/>
+        </w:rPr>
+      </w:pPr>
+      <w:r>
+        <w:rPr>
+          <w:b/>
+          <w:bCs/>
+          <w:lang w:val="es-CO"/>
+        </w:rPr>
+        <w:t xml:space="preserve">Reutilización del canal de notificación. </w:t>
+      </w:r>
+      <w:r>
+        <w:rPr>
+          <w:lang w:val="es-CO"/>
+        </w:rPr>
+        <w:t xml:space="preserve">ReporteResumenBuilder produce exactamente el diccionario que espera el FormateadorReporte del Abstract Factory, de modo que el reporte se sigue enviando por el canal preferido del usuario sin código de adaptación.</w:t>
+      </w:r>
+    </w:p>
+    <w:p>
+      <w:pPr>
+        <w:spacing w:line="480" w:lineRule="auto"/>
+        <w:jc w:val="both"/>
+        <w:rPr>
+          <w:lang w:val="es-CO"/>
+        </w:rPr>
+      </w:pPr>
+      <w:r>
+        <w:rPr>
+          <w:b/>
+          <w:bCs/>
+          <w:lang w:val="es-CO"/>
+        </w:rPr>
+        <w:t xml:space="preserve">Extensibilidad sin modificar lo existente. </w:t>
+      </w:r>
+      <w:r>
+        <w:rPr>
+          <w:lang w:val="es-CO"/>
+        </w:rPr>
+        <w:t xml:space="preserve">Incorporar un formato nuevo —Markdown, HTML o PDF— consiste en escribir un builder concreto más y registrarlo; ni el director ni los demás builders cambian. La prueba automatizada B-24 lo demuestra con un ReporteMarkdownBuilder definido dentro del propio test.</w:t>
+      </w:r>
+    </w:p>
+    <w:p>
+      <w:pPr>
+        <w:spacing w:line="480" w:lineRule="auto"/>
+        <w:jc w:val="both"/>
+        <w:rPr>
+          <w:lang w:val="es-CO"/>
+        </w:rPr>
+      </w:pPr>
+      <w:r>
+        <w:rPr>
+          <w:b/>
+          <w:bCs/>
+          <w:lang w:val="es-CO"/>
+        </w:rPr>
+        <w:t xml:space="preserve">Relación con las fábricas del proyecto. </w:t>
+      </w:r>
+      <w:r>
+        <w:rPr>
+          <w:lang w:val="es-CO"/>
+        </w:rPr>
+        <w:t xml:space="preserve">El Factory Method y el Abstract Factory crean un producto (o una familia) en una sola llamada; el Builder construye un único objeto complejo paso a paso, y ese mismo proceso puede producir representaciones diferentes.</w:t>
+      </w:r>
+    </w:p>
+    <w:p>
+      <w:pPr>
+        <w:pStyle w:val="Ttulo3"/>
+        <w:spacing w:before="200" w:after="100" w:line="480" w:lineRule="auto"/>
+        <w:rPr>
+          <w:lang w:val="es-CO"/>
+        </w:rPr>
+      </w:pPr>
+      <w:bookmarkStart w:id="45" w:name="bm_builder_justificacion"/>
+      <w:r>
+        <w:rPr>
+          <w:b/>
+          <w:bCs/>
+          <w:i/>
+          <w:iCs/>
+          <w:color w:val="000000"/>
+          <w:lang w:val="es-CO"/>
+        </w:rPr>
+        <w:t xml:space="preserve">Justificación de su Uso en el Proyecto</w:t>
+      </w:r>
+      <w:bookmarkEnd w:id="45"/>
+    </w:p>
+    <w:p>
+      <w:pPr>
+        <w:spacing w:line="480" w:lineRule="auto"/>
+        <w:jc w:val="both"/>
+        <w:rPr>
+          <w:lang w:val="es-CO"/>
+        </w:rPr>
+      </w:pPr>
+      <w:r>
+        <w:rPr>
+          <w:lang w:val="es-CO"/>
+        </w:rPr>
+        <w:t xml:space="preserve">El patrón Builder resulta pertinente para este proyecto porque, según lo planteado en la Contextualización del Proyecto, la plataforma debe ofrecer un panel de visualización con estadísticas y reportes de producción y consumo. Ese reporte se consume desde contextos distintos —la interfaz web, la bandeja de notificaciones y, potencialmente, un archivo descargable o un correo—, cada uno con su propio formato, y su contenido varía según el propósito. Construirlo paso a paso con un builder mantiene la lógica de qué información incluir separada de la de cómo presentarla, y permite añadir nuevos formatos de salida sin arriesgar los existentes, en línea con el principio abierto/cerrado.</w:t>
+      </w:r>
+    </w:p>
+    <w:p>
+      <w:pPr>
+        <w:pStyle w:val="Ttulo3"/>
+        <w:spacing w:before="200" w:after="100" w:line="480" w:lineRule="auto"/>
+        <w:rPr>
+          <w:lang w:val="es-CO"/>
+        </w:rPr>
+      </w:pPr>
+      <w:bookmarkStart w:id="46" w:name="bm_builder_validacion"/>
+      <w:r>
+        <w:rPr>
+          <w:b/>
+          <w:bCs/>
+          <w:i/>
+          <w:iCs/>
+          <w:color w:val="000000"/>
+          <w:lang w:val="es-CO"/>
+        </w:rPr>
+        <w:t xml:space="preserve">Validación del Patrón</w:t>
+      </w:r>
+      <w:bookmarkEnd w:id="46"/>
+    </w:p>
+    <w:p>
+      <w:pPr>
+        <w:spacing w:line="480" w:lineRule="auto"/>
+        <w:jc w:val="both"/>
+        <w:rPr>
+          <w:lang w:val="es-CO"/>
+        </w:rPr>
+      </w:pPr>
+      <w:r>
+        <w:rPr>
+          <w:lang w:val="es-CO"/>
+        </w:rPr>
+        <w:t xml:space="preserve">La validación del patrón Builder se realizó mediante pruebas unitarias automatizadas con pytest, que verifican que el builder abstracto no se puede instanciar, que el director ejecuta la misma secuencia de pasos con cualquier builder, que cada builder concreto devuelve su propia representación, que reiniciar aísla reportes consecutivos y que el diccionario del formato resumen respeta el contrato que consume el canal de notificación. Como se observa en la Figura 13, la suite Patrones/Semana 4/builder ejecutó 30 casos, todos superados, y el conjunto completo de pruebas del proyecto —Singleton, Factory Method, Abstract Factory y Builder— pasa sin errores.</w:t>
+      </w:r>
+    </w:p>
+    <w:p>
+      <w:pPr>
+        <w:spacing w:before="200" w:line="480" w:lineRule="auto"/>
+        <w:rPr>
+          <w:lang w:val="es-CO"/>
+        </w:rPr>
+      </w:pPr>
+      <w:bookmarkStart w:id="47" w:name="bm_fig13"/>
+      <w:r>
+        <w:rPr>
+          <w:b/>
+          <w:bCs/>
+          <w:lang w:val="es-CO"/>
+        </w:rPr>
+        <w:t xml:space="preserve">Figura 13</w:t>
+      </w:r>
+      <w:bookmarkEnd w:id="47"/>
+    </w:p>
+    <w:p>
+      <w:pPr>
+        <w:spacing w:line="480" w:lineRule="auto"/>
+        <w:rPr>
+          <w:lang w:val="es-CO"/>
+        </w:rPr>
+      </w:pPr>
+      <w:r>
+        <w:rPr>
+          <w:i/>
+          <w:iCs/>
+          <w:lang w:val="es-CO"/>
+        </w:rPr>
+        <w:t xml:space="preserve">Resultados de la ejecución de las pruebas unitarias del patrón Builder</w:t>
+      </w:r>
+    </w:p>
+    <w:p>
+      <w:pPr>
+        <w:spacing w:before="120" w:after="120"/>
+        <w:jc w:val="center"/>
+        <w:rPr>
+          <w:lang w:val="es-CO"/>
+        </w:rPr>
+      </w:pPr>
+      <w:r>
+        <w:rPr>
+          <w:i/>
+          <w:iCs/>
+          <w:color w:val="808080"/>
+          <w:lang w:val="es-CO"/>
+        </w:rPr>
+        <w:t xml:space="preserve">[ Insertar aquí la captura de pantalla ]</w:t>
+      </w:r>
+    </w:p>
+    <w:p>
+      <w:pPr>
+        <w:spacing w:before="120" w:line="480" w:lineRule="auto"/>
+        <w:rPr>
+          <w:lang w:val="es-CO"/>
+        </w:rPr>
+      </w:pPr>
+      <w:r>
+        <w:rPr>
+          <w:i/>
+          <w:iCs/>
+          <w:lang w:val="es-CO"/>
+        </w:rPr>
+        <w:t xml:space="preserve">Nota. </w:t>
+      </w:r>
+      <w:r>
+        <w:rPr>
+          <w:lang w:val="es-CO"/>
+        </w:rPr>
+        <w:t xml:space="preserve">Salida de consola de la ejecución de pytest sobre Patrones/Semana 4/builder/test_builder.py, mostrando la recolección y aprobación de los 30 casos (30 passed), agrupados por comportamiento: abstracción no instanciable, resolución del builder, secuencia de pasos del director, representaciones, reinicio, recetas, contenido calculado, uso fluido y extensibilidad.</w:t>
+      </w:r>
+    </w:p>
+    <w:p>
+      <w:pPr>
+        <w:spacing w:line="480" w:lineRule="auto"/>
+        <w:jc w:val="both"/>
+        <w:rPr>
+          <w:lang w:val="es-CO"/>
+        </w:rPr>
+      </w:pPr>
+      <w:r>
+        <w:rPr>
+          <w:lang w:val="es-CO"/>
+        </w:rPr>
+        <w:t xml:space="preserve">Además de las pruebas unitarias, el funcionamiento del patrón se validó de manera funcional a través de la API y de la interfaz. La Figura 14 muestra la documentación interactiva (Swagger) de FastAPI con el endpoint POST /reportes/generar, que recibe el parámetro formato y devuelve el reporte construido junto con el aviso dejado en la bandeja del usuario.</w:t>
+      </w:r>
+    </w:p>
+    <w:p>
+      <w:pPr>
+        <w:spacing w:before="200" w:line="480" w:lineRule="auto"/>
+        <w:rPr>
+          <w:lang w:val="es-CO"/>
+        </w:rPr>
+      </w:pPr>
+      <w:bookmarkStart w:id="48" w:name="bm_fig14"/>
+      <w:r>
+        <w:rPr>
+          <w:b/>
+          <w:bCs/>
+          <w:lang w:val="es-CO"/>
+        </w:rPr>
+        <w:t xml:space="preserve">Figura 14</w:t>
+      </w:r>
+      <w:bookmarkEnd w:id="48"/>
+    </w:p>
+    <w:p>
+      <w:pPr>
+        <w:spacing w:line="480" w:lineRule="auto"/>
+        <w:rPr>
+          <w:lang w:val="es-CO"/>
+        </w:rPr>
+      </w:pPr>
+      <w:r>
+        <w:rPr>
+          <w:i/>
+          <w:iCs/>
+          <w:lang w:val="es-CO"/>
+        </w:rPr>
+        <w:t xml:space="preserve">Documentación interactiva (Swagger) del endpoint de generación de reportes</w:t>
+      </w:r>
+    </w:p>
+    <w:p>
+      <w:pPr>
+        <w:spacing w:before="120" w:after="120"/>
+        <w:jc w:val="center"/>
+        <w:rPr>
+          <w:lang w:val="es-CO"/>
+        </w:rPr>
+      </w:pPr>
+      <w:r>
+        <w:rPr>
+          <w:i/>
+          <w:iCs/>
+          <w:color w:val="808080"/>
+          <w:lang w:val="es-CO"/>
+        </w:rPr>
+        <w:t xml:space="preserve">[ Insertar aquí la captura de pantalla ]</w:t>
+      </w:r>
+    </w:p>
+    <w:p>
+      <w:pPr>
+        <w:spacing w:before="120" w:line="480" w:lineRule="auto"/>
+        <w:rPr>
+          <w:lang w:val="es-CO"/>
+        </w:rPr>
+      </w:pPr>
+      <w:r>
+        <w:rPr>
+          <w:i/>
+          <w:iCs/>
+          <w:lang w:val="es-CO"/>
+        </w:rPr>
+        <w:t xml:space="preserve">Nota. </w:t>
+      </w:r>
+      <w:r>
+        <w:rPr>
+          <w:lang w:val="es-CO"/>
+        </w:rPr>
+        <w:t xml:space="preserve">Vista de http://localhost:8000/docs con el endpoint POST /reportes/generar y su parámetro formato (resumen, detallado o texto), además de GET /reportes/formatos, que lista los formatos disponibles.</w:t>
+      </w:r>
+    </w:p>
+    <w:p>
+      <w:pPr>
+        <w:spacing w:line="480" w:lineRule="auto"/>
+        <w:jc w:val="both"/>
+        <w:rPr>
+          <w:lang w:val="es-CO"/>
+        </w:rPr>
+      </w:pPr>
+      <w:r>
+        <w:rPr>
+          <w:lang w:val="es-CO"/>
+        </w:rPr>
+        <w:t xml:space="preserve">Por su parte, la Figura 15 evidencia el uso del patrón desde la interfaz: en la pestaña Notificaciones, el formulario Generar reporte permite elegir el formato antes de construirlo, y el reporte resultante se muestra según la representación seleccionada —secciones tituladas para el formato detallado, texto plano para el formato texto—. Es el builder correspondiente al formato el que determina la estructura del resultado, mientras que el resumen que llega a la bandeja siempre sale por el canal del usuario.</w:t>
+      </w:r>
+    </w:p>
+    <w:p>
+      <w:pPr>
+        <w:spacing w:before="200" w:line="480" w:lineRule="auto"/>
+        <w:rPr>
+          <w:lang w:val="es-CO"/>
+        </w:rPr>
+      </w:pPr>
+      <w:bookmarkStart w:id="49" w:name="bm_fig15"/>
+      <w:r>
+        <w:rPr>
+          <w:b/>
+          <w:bCs/>
+          <w:lang w:val="es-CO"/>
+        </w:rPr>
+        <w:t xml:space="preserve">Figura 15</w:t>
+      </w:r>
+      <w:bookmarkEnd w:id="49"/>
+    </w:p>
+    <w:p>
+      <w:pPr>
+        <w:spacing w:line="480" w:lineRule="auto"/>
+        <w:rPr>
+          <w:lang w:val="es-CO"/>
+        </w:rPr>
+      </w:pPr>
+      <w:r>
+        <w:rPr>
+          <w:i/>
+          <w:iCs/>
+          <w:lang w:val="es-CO"/>
+        </w:rPr>
+        <w:t xml:space="preserve">Interfaz de la plataforma generando un reporte energético en distintos formatos</w:t>
+      </w:r>
+    </w:p>
+    <w:p>
+      <w:pPr>
+        <w:spacing w:before="120" w:after="120"/>
+        <w:jc w:val="center"/>
+        <w:rPr>
+          <w:lang w:val="es-CO"/>
+        </w:rPr>
+      </w:pPr>
+      <w:r>
+        <w:rPr>
+          <w:i/>
+          <w:iCs/>
+          <w:color w:val="808080"/>
+          <w:lang w:val="es-CO"/>
+        </w:rPr>
+        <w:t xml:space="preserve">[ Insertar aquí la captura de pantalla ]</w:t>
+      </w:r>
+    </w:p>
+    <w:p>
+      <w:pPr>
+        <w:spacing w:before="120" w:line="480" w:lineRule="auto"/>
+        <w:rPr>
+          <w:lang w:val="es-CO"/>
+        </w:rPr>
+      </w:pPr>
+      <w:r>
+        <w:rPr>
+          <w:i/>
+          <w:iCs/>
+          <w:lang w:val="es-CO"/>
+        </w:rPr>
+        <w:t xml:space="preserve">Nota. </w:t>
+      </w:r>
+      <w:r>
+        <w:rPr>
+          <w:lang w:val="es-CO"/>
+        </w:rPr>
+        <w:t xml:space="preserve">Pestaña Notificaciones de la plataforma Voltia: la tarjeta Generar reporte con el selector de formato y, debajo, el último reporte generado renderizado según el builder elegido.</w:t>
+      </w:r>
+    </w:p>
+    <w:p>
+      <w:pPr>
+        <w:pStyle w:val="Ttulo3"/>
+        <w:spacing w:before="200" w:after="100" w:line="480" w:lineRule="auto"/>
+        <w:rPr>
+          <w:lang w:val="es-CO"/>
+        </w:rPr>
+      </w:pPr>
+      <w:bookmarkStart w:id="27" w:name="bm_factory_conclusion"/>
+      <w:r>
+        <w:rPr>
+          <w:b/>
+          <w:bCs/>
+          <w:i/>
+          <w:iCs/>
+          <w:color w:val="000000"/>
+          <w:lang w:val="es-CO"/>
+        </w:rPr>
         <w:lastRenderedPageBreak/>
         <w:t>Conclusión</w:t>
       </w:r>
@@ -9051,7 +10776,7 @@
         <w:rPr>
           <w:lang w:val="es-CO"/>
         </w:rPr>
-        <w:t>En resumen, el patrón Singleton garantiza que toda la plataforma comparta un mismo estado consistente, el Factory Method garantiza que cada tipo de dispositivo IoT se cree y se comporte correctamente sin acoplar ese conocimiento al resto del sistema, y el Abstract Factory garantiza que cada canal de notificación genere la familia completa de avisos con un formato coherente. Los tres patrones son complementarios: el primero define cuántas instancias de la plataforma existen, el segundo define cómo se crean los objetos individuales que la plataforma administra y el tercero define cómo se crean familias de objetos que deben usarse en conjunto.</w:t>
+        <w:t>En resumen, el patrón Singleton garantiza que toda la plataforma comparta un mismo estado consistente, el Factory Method garantiza que cada tipo de dispositivo IoT se cree y se comporte correctamente sin acoplar ese conocimiento al resto del sistema, el Abstract Factory garantiza que cada canal de notificación genere la familia completa de avisos con un formato coherente, y el Builder permite construir el reporte energético paso a paso y obtenerlo en distintas representaciones sin duplicar la lógica de negocio. Los cuatro patrones son complementarios: el primero define cuántas instancias de la plataforma existen, el segundo y el tercero definen cómo se crean los objetos —individuales o en familia— que la plataforma administra, y el cuarto define cómo se ensambla un objeto complejo a partir de esos datos.</w:t>
       </w:r>
       <w:proofErr w:type="spellStart"/>
       <w:r>
@@ -9195,6 +10920,35 @@
           <w:lang w:val="es-CO"/>
         </w:rPr>
         <w:t xml:space="preserve"> Recuperado en 2026, de https://refactoring.guru/es/design-patterns/abstract-factory</w:t>
+      </w:r>
+    </w:p>
+    <w:p>
+      <w:pPr>
+        <w:spacing w:line="480" w:lineRule="auto"/>
+        <w:ind w:left="720" w:hanging="720"/>
+        <w:rPr>
+          <w:lang w:val="es-CO"/>
+        </w:rPr>
+      </w:pPr>
+      <w:r>
+        <w:rPr>
+          <w:lang w:val="es-CO"/>
+        </w:rPr>
+        <w:t xml:space="preserve">Refactoring.Guru. (s.f.). </w:t>
+      </w:r>
+      <w:r>
+        <w:rPr>
+          <w:i/>
+          <w:iCs/>
+          <w:lang w:val="es-CO"/>
+        </w:rPr>
+        <w:t>Builder.</w:t>
+      </w:r>
+      <w:r>
+        <w:rPr>
+          <w:lang w:val="es-CO"/>
+        </w:rPr>
+        <w:t xml:space="preserve"> Recuperado en 2026, de https://refactoring.guru/es/design-patterns/builder</w:t>
       </w:r>
     </w:p>
     <w:sectPr>

</xml_diff>

<commit_message>
Aplana las carpetas de semana y agrega Patron Factory Method.md
- Los archivos de cada patron ahora estan directamente en Patrones/Semana N/
  (sin subcarpeta singleton/ factory_method/ abstract_factory/ builder/)
- Semana 3 usa un unico conftest.py para Factory Method y Abstract Factory
- Nuevo: Patrones/Semana 3/Patron Factory Method.md (mismo formato que los otros)
- Ajusta rutas en validar_pruebas.py, Patrones/README.md, README.md,
  los Patron *.md, backend/notificaciones.py y reportes.py, y el documento Word
- 91 pruebas siguen pasando
</commit_message>
<xml_diff>
--- a/Documentacion/plataforma-Comercio-Energia.docx
+++ b/Documentacion/plataforma-Comercio-Energia.docx
@@ -6007,7 +6007,7 @@
         <w:rPr>
           <w:lang w:val="es-CO"/>
         </w:rPr>
-        <w:t>en la Figura 4, la suite Patrones/Semana 2/singleton/test_singleton.py ejecutó 18 pruebas, todas ellas superadas exitosamente.</w:t>
+        <w:t>en la Figura 4, la suite Patrones/Semana 2/test_singleton.py ejecutó 18 pruebas, todas ellas superadas exitosamente.</w:t>
       </w:r>
     </w:p>
     <w:p>
@@ -6133,7 +6133,7 @@
         <w:rPr>
           <w:lang w:val="es-CO"/>
         </w:rPr>
-        <w:t>Patrones/Semana 2/singleton</w:t>
+        <w:t>Patrones/Semana 2</w:t>
       </w:r>
       <w:proofErr w:type="spellEnd"/>
       <w:r>
@@ -7404,7 +7404,7 @@
         <w:rPr>
           <w:lang w:val="es-CO"/>
         </w:rPr>
-        <w:t xml:space="preserve"> funcionan correctamente. Como se observa en la Figura 5, la suite Patrones/Semana 3/factory_method/test_factory_method.py ejecutó 16 pruebas, todas ellas superadas exitosamente, lo que confirma junto con la validación previa del patrón Singleton que el conjunto completo de pruebas automatizadas del proyecto pasa sin errores.</w:t>
+        <w:t xml:space="preserve"> funcionan correctamente. Como se observa en la Figura 5, la suite Patrones/Semana 3/test_factory_method.py ejecutó 16 pruebas, todas ellas superadas exitosamente, lo que confirma junto con la validación previa del patrón Singleton que el conjunto completo de pruebas automatizadas del proyecto pasa sin errores.</w:t>
       </w:r>
     </w:p>
     <w:p>
@@ -7530,7 +7530,7 @@
         <w:rPr>
           <w:lang w:val="es-CO"/>
         </w:rPr>
-        <w:t>Patrones/Semana 3/factory_method</w:t>
+        <w:t>Patrones/Semana 3</w:t>
       </w:r>
       <w:proofErr w:type="spellEnd"/>
       <w:r>
@@ -9230,7 +9230,7 @@
         <w:rPr>
           <w:lang w:val="es-CO"/>
         </w:rPr>
-        <w:t>La validación del patrón Abstract Factory se realizó mediante pruebas unitarias automatizadas con pytest, que verifican que el código cliente nunca instancia notificadores concretos, que cada fábrica de canal construye la familia completa (transacción, alerta IoT y reporte) y que todos los mensajes de un mismo servicio salen por el mismo canal respetando sus restricciones de formato. Como se observa en la Figura 9, la suite Patrones/Semana 3/abstract_factory ejecutó 27 casos, todos superados, y el conjunto completo de pruebas del proyecto —Singleton, Factory Method y Abstract Factory— pasa sin errores.</w:t>
+        <w:t>La validación del patrón Abstract Factory se realizó mediante pruebas unitarias automatizadas con pytest, que verifican que el código cliente nunca instancia notificadores concretos, que cada fábrica de canal construye la familia completa (transacción, alerta IoT y reporte) y que todos los mensajes de un mismo servicio salen por el mismo canal respetando sus restricciones de formato. Como se observa en la Figura 9, la suite Patrones/Semana 3/test_abstract_factory.py ejecutó 27 casos, todos superados, y el conjunto completo de pruebas del proyecto —Singleton, Factory Method y Abstract Factory— pasa sin errores.</w:t>
       </w:r>
     </w:p>
     <w:p>
@@ -9304,7 +9304,7 @@
         <w:rPr>
           <w:lang w:val="es-CO"/>
         </w:rPr>
-        <w:t>Salida de consola de la ejecución de pytest sobre Patrones/Semana 3/abstract_factory/test_abstract_factory.py, mostrando la recolección y aprobación de los 27 casos (27 passed), agrupados por comportamiento: abstracciones no instanciables, resolución de la fábrica de canal, creación de la familia completa, coherencia de canal y reglas de formato por canal.</w:t>
+        <w:t>Salida de consola de la ejecución de pytest sobre Patrones/Semana 3/test_abstract_factory.py, mostrando la recolección y aprobación de los 27 casos (27 passed), agrupados por comportamiento: abstracciones no instanciables, resolución de la fábrica de canal, creación de la familia completa, coherencia de canal y reglas de formato por canal.</w:t>
       </w:r>
     </w:p>
     <w:p>
@@ -10485,7 +10485,7 @@
         <w:rPr>
           <w:lang w:val="es-CO"/>
         </w:rPr>
-        <w:t xml:space="preserve">La validación del patrón Builder se realizó mediante pruebas unitarias automatizadas con pytest, que verifican que el builder abstracto no se puede instanciar, que el director ejecuta la misma secuencia de pasos con cualquier builder, que cada builder concreto devuelve su propia representación, que reiniciar aísla reportes consecutivos y que el diccionario del formato resumen respeta el contrato que consume el canal de notificación. Como se observa en la Figura 13, la suite Patrones/Semana 4/builder ejecutó 30 casos, todos superados, y el conjunto completo de pruebas del proyecto —Singleton, Factory Method, Abstract Factory y Builder— pasa sin errores.</w:t>
+        <w:t>La validación del patrón Builder se realizó mediante pruebas unitarias automatizadas con pytest, que verifican que el builder abstracto no se puede instanciar, que el director ejecuta la misma secuencia de pasos con cualquier builder, que cada builder concreto devuelve su propia representación, que reiniciar aísla reportes consecutivos y que el diccionario del formato resumen respeta el contrato que consume el canal de notificación. Como se observa en la Figura 13, la suite Patrones/Semana 4/test_builder.py ejecutó 30 casos, todos superados, y el conjunto completo de pruebas del proyecto —Singleton, Factory Method, Abstract Factory y Builder— pasa sin errores.</w:t>
       </w:r>
     </w:p>
     <w:p>
@@ -10559,7 +10559,7 @@
         <w:rPr>
           <w:lang w:val="es-CO"/>
         </w:rPr>
-        <w:t xml:space="preserve">Salida de consola de la ejecución de pytest sobre Patrones/Semana 4/builder/test_builder.py, mostrando la recolección y aprobación de los 30 casos (30 passed), agrupados por comportamiento: abstracción no instanciable, resolución del builder, secuencia de pasos del director, representaciones, reinicio, recetas, contenido calculado, uso fluido y extensibilidad.</w:t>
+        <w:t>Salida de consola de la ejecución de pytest sobre Patrones/Semana 4/test_builder.py, mostrando la recolección y aprobación de los 30 casos (30 passed), agrupados por comportamiento: abstracción no instanciable, resolución del builder, secuencia de pasos del director, representaciones, reinicio, recetas, contenido calculado, uso fluido y extensibilidad.</w:t>
       </w:r>
     </w:p>
     <w:p>

</xml_diff>

<commit_message>
Separa Factory Method, Abstract Factory y Builder en semanas propias
- Semana 3: solo Factory Method
- Semana 4: solo Abstract Factory (movido desde Semana 3, con su conftest.py)
- Semana 5: solo Builder (movido desde Semana 4)
- Ajusta rutas en validar_pruebas.py, Patrones/README.md, README.md,
  Patron Abstract Factory.md, Patron Builder.md, backend/notificaciones.py,
  backend/reportes.py y el documento Word
- 91 pruebas siguen pasando
</commit_message>
<xml_diff>
--- a/Documentacion/plataforma-Comercio-Energia.docx
+++ b/Documentacion/plataforma-Comercio-Energia.docx
@@ -9230,7 +9230,7 @@
         <w:rPr>
           <w:lang w:val="es-CO"/>
         </w:rPr>
-        <w:t>La validación del patrón Abstract Factory se realizó mediante pruebas unitarias automatizadas con pytest, que verifican que el código cliente nunca instancia notificadores concretos, que cada fábrica de canal construye la familia completa (transacción, alerta IoT y reporte) y que todos los mensajes de un mismo servicio salen por el mismo canal respetando sus restricciones de formato. Como se observa en la Figura 9, la suite Patrones/Semana 3/test_abstract_factory.py ejecutó 27 casos, todos superados, y el conjunto completo de pruebas del proyecto —Singleton, Factory Method y Abstract Factory— pasa sin errores.</w:t>
+        <w:t>La validación del patrón Abstract Factory se realizó mediante pruebas unitarias automatizadas con pytest, que verifican que el código cliente nunca instancia notificadores concretos, que cada fábrica de canal construye la familia completa (transacción, alerta IoT y reporte) y que todos los mensajes de un mismo servicio salen por el mismo canal respetando sus restricciones de formato. Como se observa en la Figura 9, la suite Patrones/Semana 4/test_abstract_factory.py ejecutó 27 casos, todos superados, y el conjunto completo de pruebas del proyecto —Singleton, Factory Method y Abstract Factory— pasa sin errores.</w:t>
       </w:r>
     </w:p>
     <w:p>
@@ -9304,7 +9304,7 @@
         <w:rPr>
           <w:lang w:val="es-CO"/>
         </w:rPr>
-        <w:t>Salida de consola de la ejecución de pytest sobre Patrones/Semana 3/test_abstract_factory.py, mostrando la recolección y aprobación de los 27 casos (27 passed), agrupados por comportamiento: abstracciones no instanciables, resolución de la fábrica de canal, creación de la familia completa, coherencia de canal y reglas de formato por canal.</w:t>
+        <w:t>Salida de consola de la ejecución de pytest sobre Patrones/Semana 4/test_abstract_factory.py, mostrando la recolección y aprobación de los 27 casos (27 passed), agrupados por comportamiento: abstracciones no instanciables, resolución de la fábrica de canal, creación de la familia completa, coherencia de canal y reglas de formato por canal.</w:t>
       </w:r>
     </w:p>
     <w:p>
@@ -10485,7 +10485,7 @@
         <w:rPr>
           <w:lang w:val="es-CO"/>
         </w:rPr>
-        <w:t>La validación del patrón Builder se realizó mediante pruebas unitarias automatizadas con pytest, que verifican que el builder abstracto no se puede instanciar, que el director ejecuta la misma secuencia de pasos con cualquier builder, que cada builder concreto devuelve su propia representación, que reiniciar aísla reportes consecutivos y que el diccionario del formato resumen respeta el contrato que consume el canal de notificación. Como se observa en la Figura 13, la suite Patrones/Semana 4/test_builder.py ejecutó 30 casos, todos superados, y el conjunto completo de pruebas del proyecto —Singleton, Factory Method, Abstract Factory y Builder— pasa sin errores.</w:t>
+        <w:t>La validación del patrón Builder se realizó mediante pruebas unitarias automatizadas con pytest, que verifican que el builder abstracto no se puede instanciar, que el director ejecuta la misma secuencia de pasos con cualquier builder, que cada builder concreto devuelve su propia representación, que reiniciar aísla reportes consecutivos y que el diccionario del formato resumen respeta el contrato que consume el canal de notificación. Como se observa en la Figura 13, la suite Patrones/Semana 5/test_builder.py ejecutó 30 casos, todos superados, y el conjunto completo de pruebas del proyecto —Singleton, Factory Method, Abstract Factory y Builder— pasa sin errores.</w:t>
       </w:r>
     </w:p>
     <w:p>
@@ -10559,7 +10559,7 @@
         <w:rPr>
           <w:lang w:val="es-CO"/>
         </w:rPr>
-        <w:t>Salida de consola de la ejecución de pytest sobre Patrones/Semana 4/test_builder.py, mostrando la recolección y aprobación de los 30 casos (30 passed), agrupados por comportamiento: abstracción no instanciable, resolución del builder, secuencia de pasos del director, representaciones, reinicio, recetas, contenido calculado, uso fluido y extensibilidad.</w:t>
+        <w:t>Salida de consola de la ejecución de pytest sobre Patrones/Semana 5/test_builder.py, mostrando la recolección y aprobación de los 30 casos (30 passed), agrupados por comportamiento: abstracción no instanciable, resolución del builder, secuencia de pasos del director, representaciones, reinicio, recetas, contenido calculado, uso fluido y extensibilidad.</w:t>
       </w:r>
     </w:p>
     <w:p>

</xml_diff>